<commit_message>
refactor: modularize codebase and add new API endpoints and report sections
</commit_message>
<xml_diff>
--- a/database/templates/BA_Asset_Opname_Tindak_Lanjut_DB.docx
+++ b/database/templates/BA_Asset_Opname_Tindak_Lanjut_DB.docx
@@ -295,7 +295,7 @@
                 <w:sz w:val="17"/>
                 <w:szCs w:val="17"/>
               </w:rPr>
-              <w:t xml:space="preserve">0</w:t>
+              <w:t xml:space="preserve">[MATCH]</w:t>
             </w:r>
           </w:p>
         </w:tc>
@@ -315,7 +315,7 @@
                 <w:sz w:val="17"/>
                 <w:szCs w:val="17"/>
               </w:rPr>
-              <w:t xml:space="preserve">0</w:t>
+              <w:t xml:space="preserve">[FISIK]</w:t>
             </w:r>
           </w:p>
         </w:tc>
@@ -335,7 +335,7 @@
                 <w:sz w:val="17"/>
                 <w:szCs w:val="17"/>
               </w:rPr>
-              <w:t xml:space="preserve">0</w:t>
+              <w:t xml:space="preserve">[DB]</w:t>
             </w:r>
           </w:p>
         </w:tc>
@@ -355,7 +355,7 @@
                 <w:sz w:val="17"/>
                 <w:szCs w:val="17"/>
               </w:rPr>
-              <w:t xml:space="preserve">100%</w:t>
+              <w:t xml:space="preserve">[PENCAPAIAN]</w:t>
             </w:r>
           </w:p>
         </w:tc>
@@ -639,7 +639,7 @@
                 <w:sz w:val="17"/>
                 <w:szCs w:val="17"/>
               </w:rPr>
-              <w:t xml:space="preserve">0</w:t>
+              <w:t xml:space="preserve">[TOTAL DB]</w:t>
             </w:r>
           </w:p>
         </w:tc>
@@ -659,7 +659,7 @@
                 <w:sz w:val="17"/>
                 <w:szCs w:val="17"/>
               </w:rPr>
-              <w:t xml:space="preserve">0</w:t>
+              <w:t xml:space="preserve">[SOLVED DB]</w:t>
             </w:r>
           </w:p>
         </w:tc>
@@ -679,7 +679,7 @@
                 <w:sz w:val="17"/>
                 <w:szCs w:val="17"/>
               </w:rPr>
-              <w:t xml:space="preserve">0</w:t>
+              <w:t xml:space="preserve">[UNSOLVED DB]</w:t>
             </w:r>
           </w:p>
         </w:tc>
@@ -699,7 +699,7 @@
                 <w:sz w:val="17"/>
                 <w:szCs w:val="17"/>
               </w:rPr>
-              <w:t xml:space="preserve">0</w:t>
+              <w:t xml:space="preserve">[NEW DB]</w:t>
             </w:r>
           </w:p>
         </w:tc>
@@ -732,7 +732,7 @@
           <w:sz w:val="18"/>
           <w:szCs w:val="18"/>
         </w:rPr>
-        <w:t xml:space="preserve">Adapun data DB ini terjadi karena tidak ada inputan flasma/prisma.</w:t>
+        <w:t xml:space="preserve">Adapun data DB ini terjadi karena [KETERANGAN DB].</w:t>
       </w:r>
     </w:p>
     <w:p>
@@ -829,7 +829,7 @@
                 <w:sz w:val="16"/>
                 <w:szCs w:val="16"/>
               </w:rPr>
-              <w:t xml:space="preserve">Head-Central Java And DIY Operation</w:t>
+              <w:t xml:space="preserve">[JOB TITLE AVP]</w:t>
             </w:r>
           </w:p>
         </w:tc>
@@ -863,7 +863,7 @@
                 <w:sz w:val="16"/>
                 <w:szCs w:val="16"/>
               </w:rPr>
-              <w:t xml:space="preserve">Head-Central Region Operation</w:t>
+              <w:t xml:space="preserve">[JOB TITLE FVP]</w:t>
             </w:r>
           </w:p>
         </w:tc>
@@ -931,7 +931,7 @@
                 <w:sz w:val="16"/>
                 <w:szCs w:val="16"/>
               </w:rPr>
-              <w:t xml:space="preserve">( ........................................ )</w:t>
+              <w:t xml:space="preserve">( [NAMA PJ STOCK OPNAME] )</w:t>
             </w:r>
           </w:p>
         </w:tc>
@@ -951,7 +951,7 @@
                 <w:sz w:val="16"/>
                 <w:szCs w:val="16"/>
               </w:rPr>
-              <w:t xml:space="preserve">( ........................................ )</w:t>
+              <w:t xml:space="preserve">( [NAMA AVP] )</w:t>
             </w:r>
           </w:p>
         </w:tc>
@@ -971,7 +971,7 @@
                 <w:sz w:val="16"/>
                 <w:szCs w:val="16"/>
               </w:rPr>
-              <w:t xml:space="preserve">( ........................................ )</w:t>
+              <w:t xml:space="preserve">( [NAMA FVP] )</w:t>
             </w:r>
           </w:p>
         </w:tc>

</xml_diff>